<commit_message>
main pasa a ser la version de mejora: articulo/ (mejora), articulo_replica/ (antecedente), README, guias y matriz actualizados
</commit_message>
<xml_diff>
--- a/entregas/Matriz_Respuesta_Optimizacion.docx
+++ b/entregas/Matriz_Respuesta_Optimizacion.docx
@@ -8,7 +8,7 @@
           <w:b/>
           <w:sz w:val="32"/>
         </w:rPr>
-        <w:t>Matriz de Respuesta del Autor — versión de optimización</w:t>
+        <w:t>Matriz de Respuesta del Autor — mejora del controlador difuso</w:t>
       </w:r>
     </w:p>
     <w:p>
@@ -17,7 +17,7 @@
           <w:i/>
           <w:sz w:val="20"/>
         </w:rPr>
-        <w:t>Optimización de un controlador de semáforos de lógica difusa para una intersección aislada: más allá de la réplica del controlador de Pappis y Mamdani (1977)</w:t>
+        <w:t>Mejora de un controlador de semáforos de lógica difusa para una intersección aislada: optimización del controlador de Pappis y Mamdani (1977)</w:t>
       </w:r>
     </w:p>
     <w:p>
@@ -36,7 +36,7 @@
         <w:rPr>
           <w:sz w:val="18"/>
         </w:rPr>
-        <w:t>Esta matriz acompaña a la versión de optimización del manuscrito (articulo_opt/main.pdf, 9 páginas con referencias, IEEEtran, y su suplemento suplemento.pdf). El alcance cambió: el manuscrito ya no es solo una réplica del controlador de Pappis y Mamdani (1977) sino un estudio que parte de esa réplica y optimiza el controlador difuso con un protocolo reproducible. La versión de réplica (articulo_ieee/), su suplemento y su matriz de respuesta a las 17 observaciones siguen en el repositorio y no se modifican.</w:t>
+        <w:t>Esta matriz acompaña al manuscrito (articulo/main.pdf, 9 páginas con referencias, IEEEtran, y su suplemento articulo/suplemento.pdf). El manuscrito mejora el controlador de semáforos con lógica difusa de Pappis y Mamdani (1977) mediante optimización con un protocolo reproducible. Parte de la réplica de ese controlador hecha antes por los autores (articulo_replica/ y rama replica del repositorio), que sirve de línea base y de validación del simulador.</w:t>
       </w:r>
     </w:p>
     <w:p>
@@ -47,7 +47,7 @@
         <w:rPr>
           <w:sz w:val="18"/>
         </w:rPr>
-        <w:t>La Parte A indica qué ocurre con cada una de las 17 observaciones de la revisión anterior en la nueva versión. La Parte B responde a los puntos que la réplica no podía atender por su propio alcance (novedad, comparadores, información usada, generalización). Las ubicaciones se leen del manuscrito compilado; las cifras salen de resultados/opt/evaluacion_final.json mediante codigo/gen_tablas_opt.py. Todo se reproduce con python codigo/ejecutar_pruebas.py.</w:t>
+        <w:t>La Parte A indica qué ocurre con cada una de las 17 observaciones de la revisión anterior, hechas sobre la réplica, en este manuscrito. La Parte B responde a los puntos que la réplica no podía atender por su propio alcance (novedad, comparadores, información usada, generalización). Las ubicaciones se leen del manuscrito compilado; las cifras salen de resultados/opt/evaluacion_final.json mediante codigo/gen_tablas_opt.py. Todo se reproduce con python codigo/ejecutar_pruebas.py.</w:t>
       </w:r>
     </w:p>
     <w:p>
@@ -56,7 +56,7 @@
           <w:b/>
           <w:sz w:val="20"/>
         </w:rPr>
-        <w:t>Parte A. Las 17 observaciones de la revisión anterior en la versión de optimización</w:t>
+        <w:t>Parte A. Las 17 observaciones de la revisión anterior en este manuscrito</w:t>
       </w:r>
     </w:p>
     <w:tbl>
@@ -153,7 +153,7 @@
                 <w:color w:val="FFFFFF"/>
                 <w:sz w:val="16"/>
               </w:rPr>
-              <w:t>Respuesta, ubicación y evidencia en la versión de optimización</w:t>
+              <w:t>Respuesta, ubicación y evidencia en este manuscrito</w:t>
             </w:r>
           </w:p>
         </w:tc>
@@ -538,7 +538,7 @@
                 <w:b w:val="0"/>
                 <w:sz w:val="15"/>
               </w:rPr>
-              <w:t>Además del ciclo fijo de Webster se comparan un actuado por detector, un actuado afinado con el mismo presupuesto, la presión máxima, la cota óptima por programación dinámica, una política neuronal y FLC-O (Tabla 3 (p. 5), Tabla 6 (p. 7)). El actuado afinado es un rival más fuerte que el original: FLC-O lo mejora en 22.0 % por par, con 16 pares significativamente mejores y 0 peores (Tabla 5 (p. 6)).</w:t>
+              <w:t>Además del ciclo fijo de Webster se comparan un actuado por detector, un actuado afinado con el mismo presupuesto, la presión máxima, la cota óptima por programación dinámica, una política neuronal y FLC-O (Tabla 3 (p. 5), Tabla 6 (p. 6)). El actuado afinado es un rival más fuerte que el original: FLC-O lo mejora en 22.0 % por par, con 16 pares significativamente mejores y 0 peores (Tabla 5 (p. 6)).</w:t>
             </w:r>
           </w:p>
         </w:tc>
@@ -1850,7 +1850,7 @@
                 <w:b w:val="0"/>
                 <w:sz w:val="15"/>
               </w:rPr>
-              <w:t>Se declara que la vista adelante es un supuesto del original y se mide cuánto de la mejora depende de ella (Sec. VIII-C (p. 6)). Sin ella la mejora casi desaparece: el difuso causal no supera al actuado afinado y la mejor variante causal lo supera solo en 1.7 %.</w:t>
+              <w:t>Se declara que la vista adelante es un supuesto del original y se mide cuánto de la mejora depende de ella (Sec. VIII-C (p. 7)). Sin ella la mejora casi desaparece: el difuso causal no supera al actuado afinado y la mejor variante causal lo supera solo en 1.7 %.</w:t>
             </w:r>
           </w:p>
         </w:tc>
@@ -1924,7 +1924,7 @@
                 <w:b w:val="0"/>
                 <w:sz w:val="15"/>
               </w:rPr>
-              <w:t>Cuatro conjuntos de prueba que no se usaron para entrenar: oficial, 64 caudales no vistos, demanda variable y cerca de la saturación (Tabla 6 (p. 7)).</w:t>
+              <w:t>Cuatro conjuntos de prueba que no se usaron para entrenar: oficial, 64 caudales no vistos, demanda variable y cerca de la saturación (Tabla 6 (p. 6)).</w:t>
             </w:r>
           </w:p>
         </w:tc>
@@ -2111,7 +2111,7 @@
         <w:rPr>
           <w:sz w:val="17"/>
         </w:rPr>
-        <w:t>La rama optimizacion del repositorio público https://github.com/INVESTVALQUISP/PROYECTO_INVESTIGACION/tree/optimizacion contiene el código, las pruebas, los resultados (resultados/opt/) y los manuscritos de ambas versiones; la rama main conserva la versión de réplica.</w:t>
+        <w:t>El repositorio público https://github.com/INVESTVALQUISP/PROYECTO_INVESTIGACION (rama main) contiene el código, las pruebas, los resultados (resultados/opt/) y los manuscritos (articulo/ para la mejora y articulo_replica/ para la réplica de partida); la rama replica conserva el estado anterior del repositorio, centrado solo en la réplica.</w:t>
       </w:r>
     </w:p>
     <w:p>

</xml_diff>